<commit_message>
Finished the search stuff I think
Think I finished the search stuff plz vibe check PLZ
</commit_message>
<xml_diff>
--- a/COMP 424 S26 Project 1.docx
+++ b/COMP 424 S26 Project 1.docx
@@ -1192,7 +1192,35 @@
         <w:rPr>
           <w:rFonts w:ascii="Consolas" w:hAnsi="Consolas" w:cs="Courier New"/>
         </w:rPr>
-        <w:t xml:space="preserve">def equal(pages: Map[String, </w:t>
+        <w:t xml:space="preserve">def </w:t>
+      </w:r>
+      <w:proofErr w:type="gramStart"/>
+      <w:r>
+        <w:rPr>
+          <w:rFonts w:ascii="Consolas" w:hAnsi="Consolas" w:cs="Courier New"/>
+        </w:rPr>
+        <w:t>equal(</w:t>
+      </w:r>
+      <w:proofErr w:type="gramEnd"/>
+      <w:r>
+        <w:rPr>
+          <w:rFonts w:ascii="Consolas" w:hAnsi="Consolas" w:cs="Courier New"/>
+        </w:rPr>
+        <w:t xml:space="preserve">pages: </w:t>
+      </w:r>
+      <w:proofErr w:type="gramStart"/>
+      <w:r>
+        <w:rPr>
+          <w:rFonts w:ascii="Consolas" w:hAnsi="Consolas" w:cs="Courier New"/>
+        </w:rPr>
+        <w:t>Map[</w:t>
+      </w:r>
+      <w:proofErr w:type="gramEnd"/>
+      <w:r>
+        <w:rPr>
+          <w:rFonts w:ascii="Consolas" w:hAnsi="Consolas" w:cs="Courier New"/>
+        </w:rPr>
+        <w:t xml:space="preserve">String, </w:t>
       </w:r>
       <w:proofErr w:type="spellStart"/>
       <w:proofErr w:type="gramStart"/>
@@ -1214,7 +1242,21 @@
         <w:rPr>
           <w:rFonts w:ascii="Consolas" w:hAnsi="Consolas" w:cs="Courier New"/>
         </w:rPr>
-        <w:t>: Map[String: Double]</w:t>
+        <w:t xml:space="preserve">: </w:t>
+      </w:r>
+      <w:proofErr w:type="gramStart"/>
+      <w:r>
+        <w:rPr>
+          <w:rFonts w:ascii="Consolas" w:hAnsi="Consolas" w:cs="Courier New"/>
+        </w:rPr>
+        <w:t>Map[</w:t>
+      </w:r>
+      <w:proofErr w:type="gramEnd"/>
+      <w:r>
+        <w:rPr>
+          <w:rFonts w:ascii="Consolas" w:hAnsi="Consolas" w:cs="Courier New"/>
+        </w:rPr>
+        <w:t>String: Double]</w:t>
       </w:r>
     </w:p>
     <w:p>
@@ -2421,7 +2463,7 @@
           <w:noProof/>
         </w:rPr>
         <w:drawing>
-          <wp:anchor distT="0" distB="0" distL="114300" distR="114300" simplePos="0" relativeHeight="251658240" behindDoc="0" locked="0" layoutInCell="1" allowOverlap="1" wp14:anchorId="724D4E74" wp14:editId="14DB986B">
+          <wp:anchor distT="0" distB="0" distL="114300" distR="114300" simplePos="0" relativeHeight="251658240" behindDoc="0" locked="0" layoutInCell="1" allowOverlap="1" wp14:anchorId="724D4E74" wp14:editId="7E846FDF">
             <wp:simplePos x="0" y="0"/>
             <wp:positionH relativeFrom="column">
               <wp:posOffset>4219575</wp:posOffset>

</xml_diff>